<commit_message>
Self-review fixes, plotting packages pinned, brief for Codex's final check
One name for VKontakte in the main text and appendix A. matplotlib and pillow added to pyproject.toml:
they were installed by hand and uv sync removed them. Report rebuilt: main text 9,915 of 10,000 characters.
workflow/stage1/FINAL_CHECK_CODEX.md asks Codex for the last review before submission.

Co-Authored-By: Claude Opus 5.5 <noreply@anthropic.com>
</commit_message>
<xml_diff>
--- a/deliverables/Elektrozavod_report.docx
+++ b/deliverables/Elektrozavod_report.docx
@@ -343,7 +343,7 @@
           <w:i w:val="0"/>
           <w:sz w:val="24"/>
         </w:rPr>
-        <w:t>Из реакций о заводе в соцсетях 66% против проекта и 9% за (960 реакций о заводе в выборке из 1 500, YouTube, Telegram, VK и Дзен, июнь–октябрь 2026). Половина критических реакций говорит об утрате памяти, четверть о сносе ради денег, немалая часть критиков обвиняет компанию в сговоре с городом. Письмо «Архи.ру» подписали 19 752 раза, 91% подписей пришли за первые пять недель. В сентябре, когда появились фото сноса, поиск вырос, а подписей почти не прибавилось.</w:t>
+        <w:t>Из реакций о заводе в соцсетях 66% против проекта и 9% за (960 реакций о заводе в выборке из 1 500, YouTube, Telegram, ВКонтакте и Дзен, июнь–октябрь 2026). Половина критических реакций говорит об утрате памяти, четверть о сносе ради денег, немалая часть критиков обвиняет компанию в сговоре с городом. Письмо «Архи.ру» подписали 19 752 раза, 91% подписей пришли за первые пять недель. В сентябре, когда появились фото сноса, поиск вырос, а подписей почти не прибавилось.</w:t>
       </w:r>
     </w:p>
     <w:p>
@@ -372,7 +372,7 @@
       <w:r>
         <w:drawing>
           <wp:inline xmlns:a="http://schemas.openxmlformats.org/drawingml/2006/main" xmlns:pic="http://schemas.openxmlformats.org/drawingml/2006/picture">
-            <wp:extent cx="4697326" cy="2880000"/>
+            <wp:extent cx="4626481" cy="2880000"/>
             <wp:docPr id="1" name="Picture 1"/>
             <wp:cNvGraphicFramePr>
               <a:graphicFrameLocks noChangeAspect="1"/>
@@ -393,7 +393,7 @@
                   <pic:spPr>
                     <a:xfrm>
                       <a:off x="0" y="0"/>
-                      <a:ext cx="4697326" cy="2880000"/>
+                      <a:ext cx="4626481" cy="2880000"/>
                     </a:xfrm>
                     <a:prstGeom prst="rect"/>
                   </pic:spPr>
@@ -809,7 +809,7 @@
           <w:i w:val="0"/>
           <w:sz w:val="24"/>
         </w:rPr>
-        <w:t>Каналы. Районным сообществам — публикации в их группах, памятки и встречи. Градозащитникам и москвоведам — документы, исследования и приглашение в экспертный совет. Журналистам — пакет со схемой и спикер. Широкой аудитории — ролики и карточки «что останется» с маркированной рекламой в YouTube, VK и Дзене. Бывшим арендаторам — отдельная встреча и запись их воспоминаний для экспозиции; заказчику предлагаем дать им право первой заявки на студии. Говорят архитектор и руководитель проекта, москвоведы — от своего имени.</w:t>
+        <w:t>Каналы. Районным сообществам — публикации в их группах, памятки и встречи. Градозащитникам и москвоведам — документы, исследования и приглашение в экспертный совет. Журналистам — пакет со схемой и спикер. Широкой аудитории — ролики и карточки «что останется» с маркированной рекламой в YouTube, ВКонтакте и Дзене. Бывшим арендаторам — отдельная встреча и запись их воспоминаний для экспозиции; заказчику предлагаем дать им право первой заявки на студии. Говорят архитектор и руководитель проекта, москвоведы — от своего имени.</w:t>
       </w:r>
     </w:p>
     <w:p>
@@ -1061,14 +1061,14 @@
         <w:tblLayout w:type="fixed"/>
       </w:tblPr>
       <w:tblGrid>
-        <w:gridCol w:w="2131"/>
-        <w:gridCol w:w="1770"/>
-        <w:gridCol w:w="2156"/>
-        <w:gridCol w:w="1427"/>
-        <w:gridCol w:w="1661"/>
-        <w:gridCol w:w="1470"/>
-        <w:gridCol w:w="2359"/>
-        <w:gridCol w:w="1596"/>
+        <w:gridCol w:w="2153"/>
+        <w:gridCol w:w="1766"/>
+        <w:gridCol w:w="2153"/>
+        <w:gridCol w:w="1424"/>
+        <w:gridCol w:w="1659"/>
+        <w:gridCol w:w="1469"/>
+        <w:gridCol w:w="2353"/>
+        <w:gridCol w:w="1595"/>
       </w:tblGrid>
       <w:tr>
         <w:trPr>
@@ -1076,7 +1076,7 @@
         </w:trPr>
         <w:tc>
           <w:tcPr>
-            <w:tcW w:type="dxa" w:w="2131"/>
+            <w:tcW w:type="dxa" w:w="2153"/>
           </w:tcPr>
           <w:p>
             <w:pPr>
@@ -1095,7 +1095,7 @@
         </w:tc>
         <w:tc>
           <w:tcPr>
-            <w:tcW w:type="dxa" w:w="1770"/>
+            <w:tcW w:type="dxa" w:w="1766"/>
           </w:tcPr>
           <w:p>
             <w:pPr>
@@ -1114,7 +1114,7 @@
         </w:tc>
         <w:tc>
           <w:tcPr>
-            <w:tcW w:type="dxa" w:w="2156"/>
+            <w:tcW w:type="dxa" w:w="2153"/>
           </w:tcPr>
           <w:p>
             <w:pPr>
@@ -1133,7 +1133,7 @@
         </w:tc>
         <w:tc>
           <w:tcPr>
-            <w:tcW w:type="dxa" w:w="1427"/>
+            <w:tcW w:type="dxa" w:w="1424"/>
           </w:tcPr>
           <w:p>
             <w:pPr>
@@ -1152,7 +1152,7 @@
         </w:tc>
         <w:tc>
           <w:tcPr>
-            <w:tcW w:type="dxa" w:w="1661"/>
+            <w:tcW w:type="dxa" w:w="1659"/>
           </w:tcPr>
           <w:p>
             <w:pPr>
@@ -1171,7 +1171,7 @@
         </w:tc>
         <w:tc>
           <w:tcPr>
-            <w:tcW w:type="dxa" w:w="1470"/>
+            <w:tcW w:type="dxa" w:w="1469"/>
           </w:tcPr>
           <w:p>
             <w:pPr>
@@ -1190,7 +1190,7 @@
         </w:tc>
         <w:tc>
           <w:tcPr>
-            <w:tcW w:type="dxa" w:w="2359"/>
+            <w:tcW w:type="dxa" w:w="2353"/>
           </w:tcPr>
           <w:p>
             <w:pPr>
@@ -1209,7 +1209,7 @@
         </w:tc>
         <w:tc>
           <w:tcPr>
-            <w:tcW w:type="dxa" w:w="1596"/>
+            <w:tcW w:type="dxa" w:w="1595"/>
           </w:tcPr>
           <w:p>
             <w:pPr>
@@ -1230,7 +1230,7 @@
       <w:tr>
         <w:tc>
           <w:tcPr>
-            <w:tcW w:type="dxa" w:w="2131"/>
+            <w:tcW w:type="dxa" w:w="2153"/>
           </w:tcPr>
           <w:p>
             <w:pPr>
@@ -1249,7 +1249,7 @@
         </w:tc>
         <w:tc>
           <w:tcPr>
-            <w:tcW w:type="dxa" w:w="1770"/>
+            <w:tcW w:type="dxa" w:w="1766"/>
           </w:tcPr>
           <w:p>
             <w:pPr>
@@ -1268,7 +1268,7 @@
         </w:tc>
         <w:tc>
           <w:tcPr>
-            <w:tcW w:type="dxa" w:w="2156"/>
+            <w:tcW w:type="dxa" w:w="2153"/>
           </w:tcPr>
           <w:p>
             <w:pPr>
@@ -1287,7 +1287,7 @@
         </w:tc>
         <w:tc>
           <w:tcPr>
-            <w:tcW w:type="dxa" w:w="1427"/>
+            <w:tcW w:type="dxa" w:w="1424"/>
           </w:tcPr>
           <w:p>
             <w:pPr>
@@ -1306,7 +1306,7 @@
         </w:tc>
         <w:tc>
           <w:tcPr>
-            <w:tcW w:type="dxa" w:w="1661"/>
+            <w:tcW w:type="dxa" w:w="1659"/>
           </w:tcPr>
           <w:p>
             <w:pPr>
@@ -1325,7 +1325,7 @@
         </w:tc>
         <w:tc>
           <w:tcPr>
-            <w:tcW w:type="dxa" w:w="1470"/>
+            <w:tcW w:type="dxa" w:w="1469"/>
           </w:tcPr>
           <w:p>
             <w:pPr>
@@ -1344,7 +1344,7 @@
         </w:tc>
         <w:tc>
           <w:tcPr>
-            <w:tcW w:type="dxa" w:w="2359"/>
+            <w:tcW w:type="dxa" w:w="2353"/>
           </w:tcPr>
           <w:p>
             <w:pPr>
@@ -1363,7 +1363,7 @@
         </w:tc>
         <w:tc>
           <w:tcPr>
-            <w:tcW w:type="dxa" w:w="1596"/>
+            <w:tcW w:type="dxa" w:w="1595"/>
           </w:tcPr>
           <w:p>
             <w:pPr>
@@ -1384,7 +1384,7 @@
       <w:tr>
         <w:tc>
           <w:tcPr>
-            <w:tcW w:type="dxa" w:w="2131"/>
+            <w:tcW w:type="dxa" w:w="2153"/>
           </w:tcPr>
           <w:p>
             <w:pPr>
@@ -1403,7 +1403,7 @@
         </w:tc>
         <w:tc>
           <w:tcPr>
-            <w:tcW w:type="dxa" w:w="1770"/>
+            <w:tcW w:type="dxa" w:w="1766"/>
           </w:tcPr>
           <w:p>
             <w:pPr>
@@ -1422,7 +1422,7 @@
         </w:tc>
         <w:tc>
           <w:tcPr>
-            <w:tcW w:type="dxa" w:w="2156"/>
+            <w:tcW w:type="dxa" w:w="2153"/>
           </w:tcPr>
           <w:p>
             <w:pPr>
@@ -1441,7 +1441,7 @@
         </w:tc>
         <w:tc>
           <w:tcPr>
-            <w:tcW w:type="dxa" w:w="1427"/>
+            <w:tcW w:type="dxa" w:w="1424"/>
           </w:tcPr>
           <w:p>
             <w:pPr>
@@ -1460,7 +1460,7 @@
         </w:tc>
         <w:tc>
           <w:tcPr>
-            <w:tcW w:type="dxa" w:w="1661"/>
+            <w:tcW w:type="dxa" w:w="1659"/>
           </w:tcPr>
           <w:p>
             <w:pPr>
@@ -1479,7 +1479,7 @@
         </w:tc>
         <w:tc>
           <w:tcPr>
-            <w:tcW w:type="dxa" w:w="1470"/>
+            <w:tcW w:type="dxa" w:w="1469"/>
           </w:tcPr>
           <w:p>
             <w:pPr>
@@ -1498,7 +1498,7 @@
         </w:tc>
         <w:tc>
           <w:tcPr>
-            <w:tcW w:type="dxa" w:w="2359"/>
+            <w:tcW w:type="dxa" w:w="2353"/>
           </w:tcPr>
           <w:p>
             <w:pPr>
@@ -1517,7 +1517,7 @@
         </w:tc>
         <w:tc>
           <w:tcPr>
-            <w:tcW w:type="dxa" w:w="1596"/>
+            <w:tcW w:type="dxa" w:w="1595"/>
           </w:tcPr>
           <w:p>
             <w:pPr>
@@ -1538,7 +1538,7 @@
       <w:tr>
         <w:tc>
           <w:tcPr>
-            <w:tcW w:type="dxa" w:w="2131"/>
+            <w:tcW w:type="dxa" w:w="2153"/>
           </w:tcPr>
           <w:p>
             <w:pPr>
@@ -1557,7 +1557,7 @@
         </w:tc>
         <w:tc>
           <w:tcPr>
-            <w:tcW w:type="dxa" w:w="1770"/>
+            <w:tcW w:type="dxa" w:w="1766"/>
           </w:tcPr>
           <w:p>
             <w:pPr>
@@ -1576,7 +1576,7 @@
         </w:tc>
         <w:tc>
           <w:tcPr>
-            <w:tcW w:type="dxa" w:w="2156"/>
+            <w:tcW w:type="dxa" w:w="2153"/>
           </w:tcPr>
           <w:p>
             <w:pPr>
@@ -1595,7 +1595,7 @@
         </w:tc>
         <w:tc>
           <w:tcPr>
-            <w:tcW w:type="dxa" w:w="1427"/>
+            <w:tcW w:type="dxa" w:w="1424"/>
           </w:tcPr>
           <w:p>
             <w:pPr>
@@ -1614,7 +1614,7 @@
         </w:tc>
         <w:tc>
           <w:tcPr>
-            <w:tcW w:type="dxa" w:w="1661"/>
+            <w:tcW w:type="dxa" w:w="1659"/>
           </w:tcPr>
           <w:p>
             <w:pPr>
@@ -1633,7 +1633,7 @@
         </w:tc>
         <w:tc>
           <w:tcPr>
-            <w:tcW w:type="dxa" w:w="1470"/>
+            <w:tcW w:type="dxa" w:w="1469"/>
           </w:tcPr>
           <w:p>
             <w:pPr>
@@ -1652,7 +1652,7 @@
         </w:tc>
         <w:tc>
           <w:tcPr>
-            <w:tcW w:type="dxa" w:w="2359"/>
+            <w:tcW w:type="dxa" w:w="2353"/>
           </w:tcPr>
           <w:p>
             <w:pPr>
@@ -1671,7 +1671,7 @@
         </w:tc>
         <w:tc>
           <w:tcPr>
-            <w:tcW w:type="dxa" w:w="1596"/>
+            <w:tcW w:type="dxa" w:w="1595"/>
           </w:tcPr>
           <w:p>
             <w:pPr>
@@ -1692,7 +1692,7 @@
       <w:tr>
         <w:tc>
           <w:tcPr>
-            <w:tcW w:type="dxa" w:w="2131"/>
+            <w:tcW w:type="dxa" w:w="2153"/>
           </w:tcPr>
           <w:p>
             <w:pPr>
@@ -1711,7 +1711,7 @@
         </w:tc>
         <w:tc>
           <w:tcPr>
-            <w:tcW w:type="dxa" w:w="1770"/>
+            <w:tcW w:type="dxa" w:w="1766"/>
           </w:tcPr>
           <w:p>
             <w:pPr>
@@ -1730,7 +1730,7 @@
         </w:tc>
         <w:tc>
           <w:tcPr>
-            <w:tcW w:type="dxa" w:w="2156"/>
+            <w:tcW w:type="dxa" w:w="2153"/>
           </w:tcPr>
           <w:p>
             <w:pPr>
@@ -1749,7 +1749,7 @@
         </w:tc>
         <w:tc>
           <w:tcPr>
-            <w:tcW w:type="dxa" w:w="1427"/>
+            <w:tcW w:type="dxa" w:w="1424"/>
           </w:tcPr>
           <w:p>
             <w:pPr>
@@ -1768,7 +1768,7 @@
         </w:tc>
         <w:tc>
           <w:tcPr>
-            <w:tcW w:type="dxa" w:w="1661"/>
+            <w:tcW w:type="dxa" w:w="1659"/>
           </w:tcPr>
           <w:p>
             <w:pPr>
@@ -1787,7 +1787,7 @@
         </w:tc>
         <w:tc>
           <w:tcPr>
-            <w:tcW w:type="dxa" w:w="1470"/>
+            <w:tcW w:type="dxa" w:w="1469"/>
           </w:tcPr>
           <w:p>
             <w:pPr>
@@ -1806,7 +1806,7 @@
         </w:tc>
         <w:tc>
           <w:tcPr>
-            <w:tcW w:type="dxa" w:w="2359"/>
+            <w:tcW w:type="dxa" w:w="2353"/>
           </w:tcPr>
           <w:p>
             <w:pPr>
@@ -1825,7 +1825,7 @@
         </w:tc>
         <w:tc>
           <w:tcPr>
-            <w:tcW w:type="dxa" w:w="1596"/>
+            <w:tcW w:type="dxa" w:w="1595"/>
           </w:tcPr>
           <w:p>
             <w:pPr>
@@ -1846,7 +1846,7 @@
       <w:tr>
         <w:tc>
           <w:tcPr>
-            <w:tcW w:type="dxa" w:w="2131"/>
+            <w:tcW w:type="dxa" w:w="2153"/>
           </w:tcPr>
           <w:p>
             <w:pPr>
@@ -1865,7 +1865,7 @@
         </w:tc>
         <w:tc>
           <w:tcPr>
-            <w:tcW w:type="dxa" w:w="1770"/>
+            <w:tcW w:type="dxa" w:w="1766"/>
           </w:tcPr>
           <w:p>
             <w:pPr>
@@ -1884,7 +1884,7 @@
         </w:tc>
         <w:tc>
           <w:tcPr>
-            <w:tcW w:type="dxa" w:w="2156"/>
+            <w:tcW w:type="dxa" w:w="2153"/>
           </w:tcPr>
           <w:p>
             <w:pPr>
@@ -1903,7 +1903,7 @@
         </w:tc>
         <w:tc>
           <w:tcPr>
-            <w:tcW w:type="dxa" w:w="1427"/>
+            <w:tcW w:type="dxa" w:w="1424"/>
           </w:tcPr>
           <w:p>
             <w:pPr>
@@ -1922,7 +1922,7 @@
         </w:tc>
         <w:tc>
           <w:tcPr>
-            <w:tcW w:type="dxa" w:w="1661"/>
+            <w:tcW w:type="dxa" w:w="1659"/>
           </w:tcPr>
           <w:p>
             <w:pPr>
@@ -1941,7 +1941,7 @@
         </w:tc>
         <w:tc>
           <w:tcPr>
-            <w:tcW w:type="dxa" w:w="1470"/>
+            <w:tcW w:type="dxa" w:w="1469"/>
           </w:tcPr>
           <w:p>
             <w:pPr>
@@ -1960,7 +1960,7 @@
         </w:tc>
         <w:tc>
           <w:tcPr>
-            <w:tcW w:type="dxa" w:w="2359"/>
+            <w:tcW w:type="dxa" w:w="2353"/>
           </w:tcPr>
           <w:p>
             <w:pPr>
@@ -1979,7 +1979,7 @@
         </w:tc>
         <w:tc>
           <w:tcPr>
-            <w:tcW w:type="dxa" w:w="1596"/>
+            <w:tcW w:type="dxa" w:w="1595"/>
           </w:tcPr>
           <w:p>
             <w:pPr>
@@ -2000,7 +2000,7 @@
       <w:tr>
         <w:tc>
           <w:tcPr>
-            <w:tcW w:type="dxa" w:w="2131"/>
+            <w:tcW w:type="dxa" w:w="2153"/>
           </w:tcPr>
           <w:p>
             <w:pPr>
@@ -2019,7 +2019,7 @@
         </w:tc>
         <w:tc>
           <w:tcPr>
-            <w:tcW w:type="dxa" w:w="1770"/>
+            <w:tcW w:type="dxa" w:w="1766"/>
           </w:tcPr>
           <w:p>
             <w:pPr>
@@ -2038,7 +2038,7 @@
         </w:tc>
         <w:tc>
           <w:tcPr>
-            <w:tcW w:type="dxa" w:w="2156"/>
+            <w:tcW w:type="dxa" w:w="2153"/>
           </w:tcPr>
           <w:p>
             <w:pPr>
@@ -2057,7 +2057,7 @@
         </w:tc>
         <w:tc>
           <w:tcPr>
-            <w:tcW w:type="dxa" w:w="1427"/>
+            <w:tcW w:type="dxa" w:w="1424"/>
           </w:tcPr>
           <w:p>
             <w:pPr>
@@ -2076,7 +2076,7 @@
         </w:tc>
         <w:tc>
           <w:tcPr>
-            <w:tcW w:type="dxa" w:w="1661"/>
+            <w:tcW w:type="dxa" w:w="1659"/>
           </w:tcPr>
           <w:p>
             <w:pPr>
@@ -2095,7 +2095,7 @@
         </w:tc>
         <w:tc>
           <w:tcPr>
-            <w:tcW w:type="dxa" w:w="1470"/>
+            <w:tcW w:type="dxa" w:w="1469"/>
           </w:tcPr>
           <w:p>
             <w:pPr>
@@ -2114,7 +2114,7 @@
         </w:tc>
         <w:tc>
           <w:tcPr>
-            <w:tcW w:type="dxa" w:w="2359"/>
+            <w:tcW w:type="dxa" w:w="2353"/>
           </w:tcPr>
           <w:p>
             <w:pPr>
@@ -2133,7 +2133,7 @@
         </w:tc>
         <w:tc>
           <w:tcPr>
-            <w:tcW w:type="dxa" w:w="1596"/>
+            <w:tcW w:type="dxa" w:w="1595"/>
           </w:tcPr>
           <w:p>
             <w:pPr>
@@ -2154,7 +2154,7 @@
       <w:tr>
         <w:tc>
           <w:tcPr>
-            <w:tcW w:type="dxa" w:w="2131"/>
+            <w:tcW w:type="dxa" w:w="2153"/>
           </w:tcPr>
           <w:p>
             <w:pPr>
@@ -2173,7 +2173,7 @@
         </w:tc>
         <w:tc>
           <w:tcPr>
-            <w:tcW w:type="dxa" w:w="1770"/>
+            <w:tcW w:type="dxa" w:w="1766"/>
           </w:tcPr>
           <w:p>
             <w:pPr>
@@ -2192,7 +2192,7 @@
         </w:tc>
         <w:tc>
           <w:tcPr>
-            <w:tcW w:type="dxa" w:w="2156"/>
+            <w:tcW w:type="dxa" w:w="2153"/>
           </w:tcPr>
           <w:p>
             <w:pPr>
@@ -2211,7 +2211,7 @@
         </w:tc>
         <w:tc>
           <w:tcPr>
-            <w:tcW w:type="dxa" w:w="1427"/>
+            <w:tcW w:type="dxa" w:w="1424"/>
           </w:tcPr>
           <w:p>
             <w:pPr>
@@ -2230,7 +2230,7 @@
         </w:tc>
         <w:tc>
           <w:tcPr>
-            <w:tcW w:type="dxa" w:w="1661"/>
+            <w:tcW w:type="dxa" w:w="1659"/>
           </w:tcPr>
           <w:p>
             <w:pPr>
@@ -2249,7 +2249,7 @@
         </w:tc>
         <w:tc>
           <w:tcPr>
-            <w:tcW w:type="dxa" w:w="1470"/>
+            <w:tcW w:type="dxa" w:w="1469"/>
           </w:tcPr>
           <w:p>
             <w:pPr>
@@ -2268,7 +2268,7 @@
         </w:tc>
         <w:tc>
           <w:tcPr>
-            <w:tcW w:type="dxa" w:w="2359"/>
+            <w:tcW w:type="dxa" w:w="2353"/>
           </w:tcPr>
           <w:p>
             <w:pPr>
@@ -2287,7 +2287,7 @@
         </w:tc>
         <w:tc>
           <w:tcPr>
-            <w:tcW w:type="dxa" w:w="1596"/>
+            <w:tcW w:type="dxa" w:w="1595"/>
           </w:tcPr>
           <w:p>
             <w:pPr>
@@ -2308,7 +2308,7 @@
       <w:tr>
         <w:tc>
           <w:tcPr>
-            <w:tcW w:type="dxa" w:w="2131"/>
+            <w:tcW w:type="dxa" w:w="2153"/>
           </w:tcPr>
           <w:p>
             <w:pPr>
@@ -2327,7 +2327,7 @@
         </w:tc>
         <w:tc>
           <w:tcPr>
-            <w:tcW w:type="dxa" w:w="1770"/>
+            <w:tcW w:type="dxa" w:w="1766"/>
           </w:tcPr>
           <w:p>
             <w:pPr>
@@ -2346,7 +2346,7 @@
         </w:tc>
         <w:tc>
           <w:tcPr>
-            <w:tcW w:type="dxa" w:w="2156"/>
+            <w:tcW w:type="dxa" w:w="2153"/>
           </w:tcPr>
           <w:p>
             <w:pPr>
@@ -2365,7 +2365,7 @@
         </w:tc>
         <w:tc>
           <w:tcPr>
-            <w:tcW w:type="dxa" w:w="1427"/>
+            <w:tcW w:type="dxa" w:w="1424"/>
           </w:tcPr>
           <w:p>
             <w:pPr>
@@ -2384,7 +2384,7 @@
         </w:tc>
         <w:tc>
           <w:tcPr>
-            <w:tcW w:type="dxa" w:w="1661"/>
+            <w:tcW w:type="dxa" w:w="1659"/>
           </w:tcPr>
           <w:p>
             <w:pPr>
@@ -2403,7 +2403,7 @@
         </w:tc>
         <w:tc>
           <w:tcPr>
-            <w:tcW w:type="dxa" w:w="1470"/>
+            <w:tcW w:type="dxa" w:w="1469"/>
           </w:tcPr>
           <w:p>
             <w:pPr>
@@ -2422,7 +2422,7 @@
         </w:tc>
         <w:tc>
           <w:tcPr>
-            <w:tcW w:type="dxa" w:w="2359"/>
+            <w:tcW w:type="dxa" w:w="2353"/>
           </w:tcPr>
           <w:p>
             <w:pPr>
@@ -2441,7 +2441,7 @@
         </w:tc>
         <w:tc>
           <w:tcPr>
-            <w:tcW w:type="dxa" w:w="1596"/>
+            <w:tcW w:type="dxa" w:w="1595"/>
           </w:tcPr>
           <w:p>
             <w:pPr>
@@ -2462,26 +2462,26 @@
       <w:tr>
         <w:tc>
           <w:tcPr>
-            <w:tcW w:type="dxa" w:w="2131"/>
-          </w:tcPr>
-          <w:p>
-            <w:pPr>
-              <w:spacing w:after="0" w:line="240" w:lineRule="auto"/>
-            </w:pPr>
-            <w:r>
-              <w:rPr>
-                <w:rFonts w:ascii="Times New Roman" w:hAnsi="Times New Roman" w:cs="Times New Roman" w:eastAsia="Times New Roman"/>
-                <w:b w:val="0"/>
-                <w:i w:val="0"/>
-                <w:sz w:val="18"/>
-              </w:rPr>
-              <w:t>Широкая московская аудитория (YouTube, Дзен, поиск VK)</w:t>
-            </w:r>
-          </w:p>
-        </w:tc>
-        <w:tc>
-          <w:tcPr>
-            <w:tcW w:type="dxa" w:w="1770"/>
+            <w:tcW w:type="dxa" w:w="2153"/>
+          </w:tcPr>
+          <w:p>
+            <w:pPr>
+              <w:spacing w:after="0" w:line="240" w:lineRule="auto"/>
+            </w:pPr>
+            <w:r>
+              <w:rPr>
+                <w:rFonts w:ascii="Times New Roman" w:hAnsi="Times New Roman" w:cs="Times New Roman" w:eastAsia="Times New Roman"/>
+                <w:b w:val="0"/>
+                <w:i w:val="0"/>
+                <w:sz w:val="18"/>
+              </w:rPr>
+              <w:t>Широкая московская аудитория (YouTube, Дзен, публикации ВКонтакте вне районных групп)</w:t>
+            </w:r>
+          </w:p>
+        </w:tc>
+        <w:tc>
+          <w:tcPr>
+            <w:tcW w:type="dxa" w:w="1766"/>
           </w:tcPr>
           <w:p>
             <w:pPr>
@@ -2500,7 +2500,7 @@
         </w:tc>
         <w:tc>
           <w:tcPr>
-            <w:tcW w:type="dxa" w:w="2156"/>
+            <w:tcW w:type="dxa" w:w="2153"/>
           </w:tcPr>
           <w:p>
             <w:pPr>
@@ -2519,7 +2519,7 @@
         </w:tc>
         <w:tc>
           <w:tcPr>
-            <w:tcW w:type="dxa" w:w="1427"/>
+            <w:tcW w:type="dxa" w:w="1424"/>
           </w:tcPr>
           <w:p>
             <w:pPr>
@@ -2538,7 +2538,7 @@
         </w:tc>
         <w:tc>
           <w:tcPr>
-            <w:tcW w:type="dxa" w:w="1661"/>
+            <w:tcW w:type="dxa" w:w="1659"/>
           </w:tcPr>
           <w:p>
             <w:pPr>
@@ -2557,7 +2557,7 @@
         </w:tc>
         <w:tc>
           <w:tcPr>
-            <w:tcW w:type="dxa" w:w="1470"/>
+            <w:tcW w:type="dxa" w:w="1469"/>
           </w:tcPr>
           <w:p>
             <w:pPr>
@@ -2576,7 +2576,7 @@
         </w:tc>
         <w:tc>
           <w:tcPr>
-            <w:tcW w:type="dxa" w:w="2359"/>
+            <w:tcW w:type="dxa" w:w="2353"/>
           </w:tcPr>
           <w:p>
             <w:pPr>
@@ -2595,7 +2595,7 @@
         </w:tc>
         <w:tc>
           <w:tcPr>
-            <w:tcW w:type="dxa" w:w="1596"/>
+            <w:tcW w:type="dxa" w:w="1595"/>
           </w:tcPr>
           <w:p>
             <w:pPr>
@@ -2616,7 +2616,7 @@
       <w:tr>
         <w:tc>
           <w:tcPr>
-            <w:tcW w:type="dxa" w:w="2131"/>
+            <w:tcW w:type="dxa" w:w="2153"/>
           </w:tcPr>
           <w:p>
             <w:pPr>
@@ -2635,7 +2635,7 @@
         </w:tc>
         <w:tc>
           <w:tcPr>
-            <w:tcW w:type="dxa" w:w="1770"/>
+            <w:tcW w:type="dxa" w:w="1766"/>
           </w:tcPr>
           <w:p>
             <w:pPr>
@@ -2654,7 +2654,7 @@
         </w:tc>
         <w:tc>
           <w:tcPr>
-            <w:tcW w:type="dxa" w:w="2156"/>
+            <w:tcW w:type="dxa" w:w="2153"/>
           </w:tcPr>
           <w:p>
             <w:pPr>
@@ -2673,7 +2673,7 @@
         </w:tc>
         <w:tc>
           <w:tcPr>
-            <w:tcW w:type="dxa" w:w="1427"/>
+            <w:tcW w:type="dxa" w:w="1424"/>
           </w:tcPr>
           <w:p>
             <w:pPr>
@@ -2692,7 +2692,7 @@
         </w:tc>
         <w:tc>
           <w:tcPr>
-            <w:tcW w:type="dxa" w:w="1661"/>
+            <w:tcW w:type="dxa" w:w="1659"/>
           </w:tcPr>
           <w:p>
             <w:pPr>
@@ -2711,7 +2711,7 @@
         </w:tc>
         <w:tc>
           <w:tcPr>
-            <w:tcW w:type="dxa" w:w="1470"/>
+            <w:tcW w:type="dxa" w:w="1469"/>
           </w:tcPr>
           <w:p>
             <w:pPr>
@@ -2730,7 +2730,7 @@
         </w:tc>
         <w:tc>
           <w:tcPr>
-            <w:tcW w:type="dxa" w:w="2359"/>
+            <w:tcW w:type="dxa" w:w="2353"/>
           </w:tcPr>
           <w:p>
             <w:pPr>
@@ -2749,7 +2749,7 @@
         </w:tc>
         <w:tc>
           <w:tcPr>
-            <w:tcW w:type="dxa" w:w="1596"/>
+            <w:tcW w:type="dxa" w:w="1595"/>
           </w:tcPr>
           <w:p>
             <w:pPr>
@@ -2770,7 +2770,7 @@
       <w:tr>
         <w:tc>
           <w:tcPr>
-            <w:tcW w:type="dxa" w:w="2131"/>
+            <w:tcW w:type="dxa" w:w="2153"/>
           </w:tcPr>
           <w:p>
             <w:pPr>
@@ -2789,7 +2789,7 @@
         </w:tc>
         <w:tc>
           <w:tcPr>
-            <w:tcW w:type="dxa" w:w="1770"/>
+            <w:tcW w:type="dxa" w:w="1766"/>
           </w:tcPr>
           <w:p>
             <w:pPr>
@@ -2808,7 +2808,7 @@
         </w:tc>
         <w:tc>
           <w:tcPr>
-            <w:tcW w:type="dxa" w:w="2156"/>
+            <w:tcW w:type="dxa" w:w="2153"/>
           </w:tcPr>
           <w:p>
             <w:pPr>
@@ -2827,7 +2827,7 @@
         </w:tc>
         <w:tc>
           <w:tcPr>
-            <w:tcW w:type="dxa" w:w="1427"/>
+            <w:tcW w:type="dxa" w:w="1424"/>
           </w:tcPr>
           <w:p>
             <w:pPr>
@@ -2846,7 +2846,7 @@
         </w:tc>
         <w:tc>
           <w:tcPr>
-            <w:tcW w:type="dxa" w:w="1661"/>
+            <w:tcW w:type="dxa" w:w="1659"/>
           </w:tcPr>
           <w:p>
             <w:pPr>
@@ -2865,7 +2865,7 @@
         </w:tc>
         <w:tc>
           <w:tcPr>
-            <w:tcW w:type="dxa" w:w="1470"/>
+            <w:tcW w:type="dxa" w:w="1469"/>
           </w:tcPr>
           <w:p>
             <w:pPr>
@@ -2884,7 +2884,7 @@
         </w:tc>
         <w:tc>
           <w:tcPr>
-            <w:tcW w:type="dxa" w:w="2359"/>
+            <w:tcW w:type="dxa" w:w="2353"/>
           </w:tcPr>
           <w:p>
             <w:pPr>
@@ -2903,7 +2903,7 @@
         </w:tc>
         <w:tc>
           <w:tcPr>
-            <w:tcW w:type="dxa" w:w="1596"/>
+            <w:tcW w:type="dxa" w:w="1595"/>
           </w:tcPr>
           <w:p>
             <w:pPr>

</xml_diff>